<commit_message>
Normalize account attribution and remove unsupported absence boilerplate
</commit_message>
<xml_diff>
--- a/templates/formal_report_template_complete_20260714.docx
+++ b/templates/formal_report_template_complete_20260714.docx
@@ -816,7 +816,7 @@
     </w:p>
     <w:p>
       <w:r>
-        <w:t>【仅有事实性报道时】数据周期内，境外媒体以事实性报道为主。如【来源】文章《【标题】》、【来源】文章《【标题】》、【来源】文章《【标题】》等，暂无评论性文章。</w:t>
+        <w:t>【仅有事实性报道时】本轮已审核材料中，境外媒体以事实性报道为主。如【来源】文章《【标题】》等，本轮未取得可引用的评论性文章。</w:t>
       </w:r>
     </w:p>
     <w:p>
@@ -848,7 +848,7 @@
     </w:p>
     <w:p>
       <w:r>
-        <w:t>境外网民对本次国务院常务会议关注度较低，暂无评论性观点。</w:t>
+        <w:t>本轮检索范围内未取得可核验的境外网民评论，暂不判断其关注程度或态度。</w:t>
       </w:r>
     </w:p>
     <w:p>

</xml_diff>